<commit_message>
Alhamdullah Competed A1 Ai Lab
</commit_message>
<xml_diff>
--- a/Ai Lab/Assigments/Assigment 1/Assignment # 1 By Abdullah Shah Alam.docx
+++ b/Ai Lab/Assigments/Assigment 1/Assignment # 1 By Abdullah Shah Alam.docx
@@ -15006,11 +15006,9 @@
           <w:szCs w:val="24"/>
           <w:lang w:val="en-US"/>
         </w:rPr>
-        <w:t>…….and so on</w:t>
-      </w:r>
-    </w:p>
-    <w:p>
-      <w:pPr>
+        <w:t>…….and</w:t>
+      </w:r>
+      <w:r>
         <w:rPr>
           <w:rFonts w:ascii="Times New Roman" w:hAnsi="Times New Roman" w:cs="Times New Roman"/>
           <w:b/>
@@ -15018,9 +15016,31 @@
           <w:szCs w:val="24"/>
           <w:lang w:val="en-US"/>
         </w:rPr>
-      </w:pPr>
+        <w:t xml:space="preserve"> same code</w:t>
+      </w:r>
       <w:bookmarkStart w:id="0" w:name="_GoBack"/>
       <w:bookmarkEnd w:id="0"/>
+      <w:r>
+        <w:rPr>
+          <w:rFonts w:ascii="Times New Roman" w:hAnsi="Times New Roman" w:cs="Times New Roman"/>
+          <w:b/>
+          <w:sz w:val="28"/>
+          <w:szCs w:val="24"/>
+          <w:lang w:val="en-US"/>
+        </w:rPr>
+        <w:t xml:space="preserve"> so on</w:t>
+      </w:r>
+    </w:p>
+    <w:p>
+      <w:pPr>
+        <w:rPr>
+          <w:rFonts w:ascii="Times New Roman" w:hAnsi="Times New Roman" w:cs="Times New Roman"/>
+          <w:b/>
+          <w:sz w:val="28"/>
+          <w:szCs w:val="24"/>
+          <w:lang w:val="en-US"/>
+        </w:rPr>
+      </w:pPr>
     </w:p>
     <w:p>
       <w:pPr>

</xml_diff>